<commit_message>
Improved and fixed the errors of the feedback of the Ontology requirements asisgment
</commit_message>
<xml_diff>
--- a/Ontology requirements assignment/Assignments completed/Discarded Data Field Group 3 25-26.docx
+++ b/Ontology requirements assignment/Assignments completed/Discarded Data Field Group 3 25-26.docx
@@ -15,7 +15,21 @@
           <w:rFonts w:ascii="Bookman Old Style" w:hAnsi="Bookman Old Style"/>
           <w:lang w:val="en-US"/>
         </w:rPr>
-        <w:t>Before designing the ontology, all the datasets were reviewed to decide how each column should be represented in the model.</w:t>
+        <w:t xml:space="preserve">Before designing the ontology, all columns from the selected datasets were reviewed </w:t>
+      </w:r>
+      <w:r>
+        <w:rPr>
+          <w:rFonts w:ascii="Bookman Old Style" w:hAnsi="Bookman Old Style"/>
+          <w:lang w:val="en-US"/>
+        </w:rPr>
+        <w:t>to</w:t>
+      </w:r>
+      <w:r>
+        <w:rPr>
+          <w:rFonts w:ascii="Bookman Old Style" w:hAnsi="Bookman Old Style"/>
+          <w:lang w:val="en-US"/>
+        </w:rPr>
+        <w:t xml:space="preserve"> determine how each of them should be represented in the semantic model.</w:t>
       </w:r>
     </w:p>
     <w:p>
@@ -31,35 +45,14 @@
           <w:rFonts w:ascii="Bookman Old Style" w:hAnsi="Bookman Old Style"/>
           <w:lang w:val="en-US"/>
         </w:rPr>
-        <w:t>No fields were completely removed from the domain. However, some of them were not modeled as independent classes, but instead as datatype properties or simple identifiers, since they do not represent separate concepts.</w:t>
-      </w:r>
-    </w:p>
-    <w:p>
-      <w:pPr>
-        <w:jc w:val="both"/>
-        <w:rPr>
-          <w:rFonts w:ascii="Bookman Old Style" w:hAnsi="Bookman Old Style"/>
-        </w:rPr>
-      </w:pPr>
-      <w:r>
-        <w:rPr>
-          <w:rFonts w:ascii="Bookman Old Style" w:hAnsi="Bookman Old Style"/>
-        </w:rPr>
-        <w:t xml:space="preserve">For </w:t>
-      </w:r>
-      <w:proofErr w:type="spellStart"/>
-      <w:r>
-        <w:rPr>
-          <w:rFonts w:ascii="Bookman Old Style" w:hAnsi="Bookman Old Style"/>
-        </w:rPr>
-        <w:t>example</w:t>
-      </w:r>
-      <w:proofErr w:type="spellEnd"/>
-      <w:r>
-        <w:rPr>
-          <w:rFonts w:ascii="Bookman Old Style" w:hAnsi="Bookman Old Style"/>
-        </w:rPr>
-        <w:t>:</w:t>
+        <w:t>The decisions were guided by the defined use cases, ensuring that only the information relevant for reasoning tasks and domain representation was modeled as classes or relationships. No fields were completely removed from the domain. However, some of them were not modeled as independent classes, but instead represented as datatype properties or identifiers, since they do not correspond to separate domain concepts.</w:t>
+      </w:r>
+      <w:r>
+        <w:rPr>
+          <w:rFonts w:ascii="Bookman Old Style" w:hAnsi="Bookman Old Style"/>
+          <w:lang w:val="en-US"/>
+        </w:rPr>
+        <w:t xml:space="preserve"> For example,</w:t>
       </w:r>
     </w:p>
     <w:p>
@@ -67,7 +60,7 @@
         <w:pStyle w:val="Prrafodelista"/>
         <w:numPr>
           <w:ilvl w:val="0"/>
-          <w:numId w:val="2"/>
+          <w:numId w:val="3"/>
         </w:numPr>
         <w:jc w:val="both"/>
         <w:rPr>
@@ -80,7 +73,14 @@
           <w:rFonts w:ascii="Bookman Old Style" w:hAnsi="Bookman Old Style"/>
           <w:lang w:val="en-US"/>
         </w:rPr>
-        <w:t xml:space="preserve">The </w:t>
+        <w:t>T</w:t>
+      </w:r>
+      <w:r>
+        <w:rPr>
+          <w:rFonts w:ascii="Bookman Old Style" w:hAnsi="Bookman Old Style"/>
+          <w:lang w:val="en-US"/>
+        </w:rPr>
+        <w:t xml:space="preserve">he </w:t>
       </w:r>
       <w:r>
         <w:rPr>
@@ -89,14 +89,14 @@
           <w:bCs/>
           <w:lang w:val="en-US"/>
         </w:rPr>
-        <w:t>"Number"</w:t>
-      </w:r>
-      <w:r>
-        <w:rPr>
-          <w:rFonts w:ascii="Bookman Old Style" w:hAnsi="Bookman Old Style"/>
-          <w:lang w:val="en-US"/>
-        </w:rPr>
-        <w:t xml:space="preserve"> column in </w:t>
+        <w:t>“Number” field</w:t>
+      </w:r>
+      <w:r>
+        <w:rPr>
+          <w:rFonts w:ascii="Bookman Old Style" w:hAnsi="Bookman Old Style"/>
+          <w:lang w:val="en-US"/>
+        </w:rPr>
+        <w:t xml:space="preserve"> in </w:t>
       </w:r>
       <w:r>
         <w:rPr>
@@ -112,23 +112,7 @@
           <w:rFonts w:ascii="Bookman Old Style" w:hAnsi="Bookman Old Style"/>
           <w:lang w:val="en-US"/>
         </w:rPr>
-        <w:t xml:space="preserve"> was modeled as an identifier of the class </w:t>
-      </w:r>
-      <w:r>
-        <w:rPr>
-          <w:rFonts w:ascii="Bookman Old Style" w:hAnsi="Bookman Old Style"/>
-          <w:i/>
-          <w:iCs/>
-          <w:lang w:val="en-US"/>
-        </w:rPr>
-        <w:t>Digimon</w:t>
-      </w:r>
-      <w:r>
-        <w:rPr>
-          <w:rFonts w:ascii="Bookman Old Style" w:hAnsi="Bookman Old Style"/>
-          <w:lang w:val="en-US"/>
-        </w:rPr>
-        <w:t>, and not as a separate entity. It uniquely identifies each Digimon but does not describe a concept on its own.</w:t>
+        <w:t xml:space="preserve"> was modeled as an identifier of the Digimon class, since it only serves to uniquely identify each Digimon and is not used in the use cases, where Digimon are retrieved based on their attributes, statistics, abilities and evolution paths.</w:t>
       </w:r>
     </w:p>
     <w:p>
@@ -136,7 +120,7 @@
         <w:pStyle w:val="Prrafodelista"/>
         <w:numPr>
           <w:ilvl w:val="0"/>
-          <w:numId w:val="2"/>
+          <w:numId w:val="3"/>
         </w:numPr>
         <w:jc w:val="both"/>
         <w:rPr>
@@ -149,55 +133,119 @@
           <w:rFonts w:ascii="Bookman Old Style" w:hAnsi="Bookman Old Style"/>
           <w:lang w:val="en-US"/>
         </w:rPr>
-        <w:t>The statistical values (</w:t>
-      </w:r>
-      <w:r>
-        <w:rPr>
-          <w:rFonts w:ascii="Bookman Old Style" w:hAnsi="Bookman Old Style"/>
-          <w:i/>
-          <w:iCs/>
-          <w:lang w:val="en-US"/>
-        </w:rPr>
-        <w:t>HP, SP, Attack, Defense, Intelligence, Speed</w:t>
-      </w:r>
-      <w:r>
-        <w:rPr>
-          <w:rFonts w:ascii="Bookman Old Style" w:hAnsi="Bookman Old Style"/>
-          <w:lang w:val="en-US"/>
-        </w:rPr>
-        <w:t xml:space="preserve">) were modeled as datatype properties of </w:t>
-      </w:r>
-      <w:r>
-        <w:rPr>
-          <w:rFonts w:ascii="Bookman Old Style" w:hAnsi="Bookman Old Style"/>
-          <w:i/>
-          <w:iCs/>
-          <w:lang w:val="en-US"/>
-        </w:rPr>
-        <w:t>Digimon</w:t>
-      </w:r>
-      <w:r>
-        <w:rPr>
-          <w:rFonts w:ascii="Bookman Old Style" w:hAnsi="Bookman Old Style"/>
-          <w:lang w:val="en-US"/>
-        </w:rPr>
-        <w:t xml:space="preserve"> instead of creating a separate </w:t>
-      </w:r>
-      <w:r>
-        <w:rPr>
-          <w:rFonts w:ascii="Bookman Old Style" w:hAnsi="Bookman Old Style"/>
-          <w:i/>
-          <w:iCs/>
-          <w:lang w:val="en-US"/>
-        </w:rPr>
-        <w:t>Statistic</w:t>
-      </w:r>
-      <w:r>
-        <w:rPr>
-          <w:rFonts w:ascii="Bookman Old Style" w:hAnsi="Bookman Old Style"/>
-          <w:lang w:val="en-US"/>
-        </w:rPr>
-        <w:t xml:space="preserve"> class. This keeps the model simpler while still representing all numerical information.</w:t>
+        <w:t xml:space="preserve">Similarly, </w:t>
+      </w:r>
+      <w:r>
+        <w:rPr>
+          <w:rFonts w:ascii="Bookman Old Style" w:hAnsi="Bookman Old Style"/>
+          <w:b/>
+          <w:bCs/>
+          <w:lang w:val="en-US"/>
+        </w:rPr>
+        <w:t>statistical values</w:t>
+      </w:r>
+      <w:r>
+        <w:rPr>
+          <w:rFonts w:ascii="Bookman Old Style" w:hAnsi="Bookman Old Style"/>
+          <w:lang w:val="en-US"/>
+        </w:rPr>
+        <w:t xml:space="preserve"> such as </w:t>
+      </w:r>
+      <w:r>
+        <w:rPr>
+          <w:rFonts w:ascii="Bookman Old Style" w:hAnsi="Bookman Old Style"/>
+          <w:b/>
+          <w:bCs/>
+          <w:lang w:val="en-US"/>
+        </w:rPr>
+        <w:t>HP</w:t>
+      </w:r>
+      <w:r>
+        <w:rPr>
+          <w:rFonts w:ascii="Bookman Old Style" w:hAnsi="Bookman Old Style"/>
+          <w:lang w:val="en-US"/>
+        </w:rPr>
+        <w:t>,</w:t>
+      </w:r>
+      <w:r>
+        <w:rPr>
+          <w:rFonts w:ascii="Bookman Old Style" w:hAnsi="Bookman Old Style"/>
+          <w:b/>
+          <w:bCs/>
+          <w:lang w:val="en-US"/>
+        </w:rPr>
+        <w:t xml:space="preserve"> SP</w:t>
+      </w:r>
+      <w:r>
+        <w:rPr>
+          <w:rFonts w:ascii="Bookman Old Style" w:hAnsi="Bookman Old Style"/>
+          <w:lang w:val="en-US"/>
+        </w:rPr>
+        <w:t>,</w:t>
+      </w:r>
+      <w:r>
+        <w:rPr>
+          <w:rFonts w:ascii="Bookman Old Style" w:hAnsi="Bookman Old Style"/>
+          <w:b/>
+          <w:bCs/>
+          <w:lang w:val="en-US"/>
+        </w:rPr>
+        <w:t xml:space="preserve"> Attack</w:t>
+      </w:r>
+      <w:r>
+        <w:rPr>
+          <w:rFonts w:ascii="Bookman Old Style" w:hAnsi="Bookman Old Style"/>
+          <w:lang w:val="en-US"/>
+        </w:rPr>
+        <w:t>,</w:t>
+      </w:r>
+      <w:r>
+        <w:rPr>
+          <w:rFonts w:ascii="Bookman Old Style" w:hAnsi="Bookman Old Style"/>
+          <w:b/>
+          <w:bCs/>
+          <w:lang w:val="en-US"/>
+        </w:rPr>
+        <w:t xml:space="preserve"> Defense</w:t>
+      </w:r>
+      <w:r>
+        <w:rPr>
+          <w:rFonts w:ascii="Bookman Old Style" w:hAnsi="Bookman Old Style"/>
+          <w:lang w:val="en-US"/>
+        </w:rPr>
+        <w:t>,</w:t>
+      </w:r>
+      <w:r>
+        <w:rPr>
+          <w:rFonts w:ascii="Bookman Old Style" w:hAnsi="Bookman Old Style"/>
+          <w:b/>
+          <w:bCs/>
+          <w:lang w:val="en-US"/>
+        </w:rPr>
+        <w:t xml:space="preserve"> Intelligence </w:t>
+      </w:r>
+      <w:r>
+        <w:rPr>
+          <w:rFonts w:ascii="Bookman Old Style" w:hAnsi="Bookman Old Style"/>
+          <w:lang w:val="en-US"/>
+        </w:rPr>
+        <w:t>and</w:t>
+      </w:r>
+      <w:r>
+        <w:rPr>
+          <w:rFonts w:ascii="Bookman Old Style" w:hAnsi="Bookman Old Style"/>
+          <w:b/>
+          <w:bCs/>
+          <w:lang w:val="en-US"/>
+        </w:rPr>
+        <w:t xml:space="preserve"> Speed</w:t>
+      </w:r>
+      <w:r>
+        <w:rPr>
+          <w:rFonts w:ascii="Bookman Old Style" w:hAnsi="Bookman Old Style"/>
+          <w:lang w:val="en-US"/>
+        </w:rPr>
+        <w:t xml:space="preserve"> were modeled as datatype properties instead of creating a separate class, as they represent numerical characteristics used in the Battle Team Planning use case for comparison and optimization.</w:t>
       </w:r>
     </w:p>
     <w:p>
@@ -205,7 +253,7 @@
         <w:pStyle w:val="Prrafodelista"/>
         <w:numPr>
           <w:ilvl w:val="0"/>
-          <w:numId w:val="2"/>
+          <w:numId w:val="3"/>
         </w:numPr>
         <w:jc w:val="both"/>
         <w:rPr>
@@ -218,7 +266,7 @@
           <w:rFonts w:ascii="Bookman Old Style" w:hAnsi="Bookman Old Style"/>
           <w:lang w:val="en-US"/>
         </w:rPr>
-        <w:t xml:space="preserve">The </w:t>
+        <w:t xml:space="preserve">In the same way, fields such as </w:t>
       </w:r>
       <w:r>
         <w:rPr>
@@ -227,14 +275,30 @@
           <w:bCs/>
           <w:lang w:val="en-US"/>
         </w:rPr>
-        <w:t>"Type"</w:t>
-      </w:r>
-      <w:r>
-        <w:rPr>
-          <w:rFonts w:ascii="Bookman Old Style" w:hAnsi="Bookman Old Style"/>
-          <w:lang w:val="en-US"/>
-        </w:rPr>
-        <w:t xml:space="preserve"> column in </w:t>
+        <w:t>“Power”</w:t>
+      </w:r>
+      <w:r>
+        <w:rPr>
+          <w:rFonts w:ascii="Bookman Old Style" w:hAnsi="Bookman Old Style"/>
+          <w:lang w:val="en-US"/>
+        </w:rPr>
+        <w:t xml:space="preserve"> and </w:t>
+      </w:r>
+      <w:r>
+        <w:rPr>
+          <w:rFonts w:ascii="Bookman Old Style" w:hAnsi="Bookman Old Style"/>
+          <w:b/>
+          <w:bCs/>
+          <w:lang w:val="en-US"/>
+        </w:rPr>
+        <w:t>“SP Cost”</w:t>
+      </w:r>
+      <w:r>
+        <w:rPr>
+          <w:rFonts w:ascii="Bookman Old Style" w:hAnsi="Bookman Old Style"/>
+          <w:lang w:val="en-US"/>
+        </w:rPr>
+        <w:t xml:space="preserve"> in </w:t>
       </w:r>
       <w:r>
         <w:rPr>
@@ -250,73 +314,7 @@
           <w:rFonts w:ascii="Bookman Old Style" w:hAnsi="Bookman Old Style"/>
           <w:lang w:val="en-US"/>
         </w:rPr>
-        <w:t xml:space="preserve"> was treated as a classification specific to </w:t>
-      </w:r>
-      <w:r>
-        <w:rPr>
-          <w:rFonts w:ascii="Bookman Old Style" w:hAnsi="Bookman Old Style"/>
-          <w:i/>
-          <w:iCs/>
-          <w:lang w:val="en-US"/>
-        </w:rPr>
-        <w:t>Move</w:t>
-      </w:r>
-      <w:r>
-        <w:rPr>
-          <w:rFonts w:ascii="Bookman Old Style" w:hAnsi="Bookman Old Style"/>
-          <w:lang w:val="en-US"/>
-        </w:rPr>
-        <w:t xml:space="preserve">. It was not merged with </w:t>
-      </w:r>
-      <w:proofErr w:type="spellStart"/>
-      <w:r>
-        <w:rPr>
-          <w:rFonts w:ascii="Bookman Old Style" w:hAnsi="Bookman Old Style"/>
-          <w:i/>
-          <w:iCs/>
-          <w:lang w:val="en-US"/>
-        </w:rPr>
-        <w:t>DigimonType</w:t>
-      </w:r>
-      <w:proofErr w:type="spellEnd"/>
-      <w:r>
-        <w:rPr>
-          <w:rFonts w:ascii="Bookman Old Style" w:hAnsi="Bookman Old Style"/>
-          <w:lang w:val="en-US"/>
-        </w:rPr>
-        <w:t xml:space="preserve"> because both fields refer to different meanings within the domain.</w:t>
-      </w:r>
-    </w:p>
-    <w:p>
-      <w:pPr>
-        <w:jc w:val="both"/>
-        <w:rPr>
-          <w:rFonts w:ascii="Bookman Old Style" w:hAnsi="Bookman Old Style"/>
-          <w:lang w:val="en-US"/>
-        </w:rPr>
-      </w:pPr>
-      <w:r>
-        <w:rPr>
-          <w:rFonts w:ascii="Bookman Old Style" w:hAnsi="Bookman Old Style"/>
-          <w:lang w:val="en-US"/>
-        </w:rPr>
-        <w:t xml:space="preserve">These decisions were taken to keep the </w:t>
-      </w:r>
-      <w:proofErr w:type="gramStart"/>
-      <w:r>
-        <w:rPr>
-          <w:rFonts w:ascii="Bookman Old Style" w:hAnsi="Bookman Old Style"/>
-          <w:lang w:val="en-US"/>
-        </w:rPr>
-        <w:t>ontology</w:t>
-      </w:r>
-      <w:proofErr w:type="gramEnd"/>
-      <w:r>
-        <w:rPr>
-          <w:rFonts w:ascii="Bookman Old Style" w:hAnsi="Bookman Old Style"/>
-          <w:lang w:val="en-US"/>
-        </w:rPr>
-        <w:t xml:space="preserve"> clear and manageable, while ensuring that all relevant information from the datasets is properly represented.</w:t>
+        <w:t xml:space="preserve"> were represented as datatype properties, since they describe quantitative aspects of moves that are used in the evaluation of strategies.</w:t>
       </w:r>
     </w:p>
     <w:sectPr>
@@ -332,6 +330,92 @@
 <file path=word/numbering.xml><?xml version="1.0" encoding="utf-8"?>
 <w:numbering xmlns:wpc="http://schemas.microsoft.com/office/word/2010/wordprocessingCanvas" xmlns:cx="http://schemas.microsoft.com/office/drawing/2014/chartex" xmlns:cx1="http://schemas.microsoft.com/office/drawing/2015/9/8/chartex" xmlns:cx2="http://schemas.microsoft.com/office/drawing/2015/10/21/chartex" xmlns:cx3="http://schemas.microsoft.com/office/drawing/2016/5/9/chartex" xmlns:cx4="http://schemas.microsoft.com/office/drawing/2016/5/10/chartex" xmlns:cx5="http://schemas.microsoft.com/office/drawing/2016/5/11/chartex" xmlns:cx6="http://schemas.microsoft.com/office/drawing/2016/5/12/chartex" xmlns:cx7="http://schemas.microsoft.com/office/drawing/2016/5/13/chartex" xmlns:cx8="http://schemas.microsoft.com/office/drawing/2016/5/14/chartex" xmlns:mc="http://schemas.openxmlformats.org/markup-compatibility/2006" xmlns:aink="http://schemas.microsoft.com/office/drawing/2016/ink" xmlns:am3d="http://schemas.microsoft.com/office/drawing/2017/model3d" xmlns:o="urn:schemas-microsoft-com:office:office" xmlns:oel="http://schemas.microsoft.com/office/2019/extlst" xmlns:r="http://schemas.openxmlformats.org/officeDocument/2006/relationships" xmlns:m="http://schemas.openxmlformats.org/officeDocument/2006/math" xmlns:v="urn:schemas-microsoft-com:vml" xmlns:wp14="http://schemas.microsoft.com/office/word/2010/wordprocessingDrawing" xmlns:wp="http://schemas.openxmlformats.org/drawingml/2006/wordprocessingDrawing" xmlns:w10="urn:schemas-microsoft-com:office:word" xmlns:w="http://schemas.openxmlformats.org/wordprocessingml/2006/main" xmlns:w14="http://schemas.microsoft.com/office/word/2010/wordml" xmlns:w15="http://schemas.microsoft.com/office/word/2012/wordml" xmlns:w16cex="http://schemas.microsoft.com/office/word/2018/wordml/cex" xmlns:w16cid="http://schemas.microsoft.com/office/word/2016/wordml/cid" xmlns:w16="http://schemas.microsoft.com/office/word/2018/wordml" xmlns:w16du="http://schemas.microsoft.com/office/word/2023/wordml/word16du" xmlns:w16sdtdh="http://schemas.microsoft.com/office/word/2020/wordml/sdtdatahash" xmlns:w16sdtfl="http://schemas.microsoft.com/office/word/2024/wordml/sdtformatlock" xmlns:w16se="http://schemas.microsoft.com/office/word/2015/wordml/symex" xmlns:wpg="http://schemas.microsoft.com/office/word/2010/wordprocessingGroup" xmlns:wpi="http://schemas.microsoft.com/office/word/2010/wordprocessingInk" xmlns:wne="http://schemas.microsoft.com/office/word/2006/wordml" xmlns:wps="http://schemas.microsoft.com/office/word/2010/wordprocessingShape" mc:Ignorable="w14 w15 w16se w16cid w16 w16cex w16sdtdh w16sdtfl w16du wp14">
   <w:abstractNum w:abstractNumId="0" w15:restartNumberingAfterBreak="0">
+    <w:nsid w:val="296968D8"/>
+    <w:multiLevelType w:val="hybridMultilevel"/>
+    <w:tmpl w:val="EFB6CF14"/>
+    <w:lvl w:ilvl="0" w:tplc="0C0A000F">
+      <w:start w:val="1"/>
+      <w:numFmt w:val="decimal"/>
+      <w:lvlText w:val="%1."/>
+      <w:lvlJc w:val="left"/>
+      <w:pPr>
+        <w:ind w:left="720" w:hanging="360"/>
+      </w:pPr>
+    </w:lvl>
+    <w:lvl w:ilvl="1" w:tplc="0C0A0019" w:tentative="1">
+      <w:start w:val="1"/>
+      <w:numFmt w:val="lowerLetter"/>
+      <w:lvlText w:val="%2."/>
+      <w:lvlJc w:val="left"/>
+      <w:pPr>
+        <w:ind w:left="1440" w:hanging="360"/>
+      </w:pPr>
+    </w:lvl>
+    <w:lvl w:ilvl="2" w:tplc="0C0A001B" w:tentative="1">
+      <w:start w:val="1"/>
+      <w:numFmt w:val="lowerRoman"/>
+      <w:lvlText w:val="%3."/>
+      <w:lvlJc w:val="right"/>
+      <w:pPr>
+        <w:ind w:left="2160" w:hanging="180"/>
+      </w:pPr>
+    </w:lvl>
+    <w:lvl w:ilvl="3" w:tplc="0C0A000F" w:tentative="1">
+      <w:start w:val="1"/>
+      <w:numFmt w:val="decimal"/>
+      <w:lvlText w:val="%4."/>
+      <w:lvlJc w:val="left"/>
+      <w:pPr>
+        <w:ind w:left="2880" w:hanging="360"/>
+      </w:pPr>
+    </w:lvl>
+    <w:lvl w:ilvl="4" w:tplc="0C0A0019" w:tentative="1">
+      <w:start w:val="1"/>
+      <w:numFmt w:val="lowerLetter"/>
+      <w:lvlText w:val="%5."/>
+      <w:lvlJc w:val="left"/>
+      <w:pPr>
+        <w:ind w:left="3600" w:hanging="360"/>
+      </w:pPr>
+    </w:lvl>
+    <w:lvl w:ilvl="5" w:tplc="0C0A001B" w:tentative="1">
+      <w:start w:val="1"/>
+      <w:numFmt w:val="lowerRoman"/>
+      <w:lvlText w:val="%6."/>
+      <w:lvlJc w:val="right"/>
+      <w:pPr>
+        <w:ind w:left="4320" w:hanging="180"/>
+      </w:pPr>
+    </w:lvl>
+    <w:lvl w:ilvl="6" w:tplc="0C0A000F" w:tentative="1">
+      <w:start w:val="1"/>
+      <w:numFmt w:val="decimal"/>
+      <w:lvlText w:val="%7."/>
+      <w:lvlJc w:val="left"/>
+      <w:pPr>
+        <w:ind w:left="5040" w:hanging="360"/>
+      </w:pPr>
+    </w:lvl>
+    <w:lvl w:ilvl="7" w:tplc="0C0A0019" w:tentative="1">
+      <w:start w:val="1"/>
+      <w:numFmt w:val="lowerLetter"/>
+      <w:lvlText w:val="%8."/>
+      <w:lvlJc w:val="left"/>
+      <w:pPr>
+        <w:ind w:left="5760" w:hanging="360"/>
+      </w:pPr>
+    </w:lvl>
+    <w:lvl w:ilvl="8" w:tplc="0C0A001B" w:tentative="1">
+      <w:start w:val="1"/>
+      <w:numFmt w:val="lowerRoman"/>
+      <w:lvlText w:val="%9."/>
+      <w:lvlJc w:val="right"/>
+      <w:pPr>
+        <w:ind w:left="6480" w:hanging="180"/>
+      </w:pPr>
+    </w:lvl>
+  </w:abstractNum>
+  <w:abstractNum w:abstractNumId="1" w15:restartNumberingAfterBreak="0">
     <w:nsid w:val="4F57027A"/>
     <w:multiLevelType w:val="multilevel"/>
     <w:tmpl w:val="65BC4608"/>
@@ -480,7 +564,7 @@
       </w:rPr>
     </w:lvl>
   </w:abstractNum>
-  <w:abstractNum w:abstractNumId="1" w15:restartNumberingAfterBreak="0">
+  <w:abstractNum w:abstractNumId="2" w15:restartNumberingAfterBreak="0">
     <w:nsid w:val="60E15F5D"/>
     <w:multiLevelType w:val="hybridMultilevel"/>
     <w:tmpl w:val="660C3F0A"/>
@@ -496,7 +580,7 @@
         <w:rFonts w:ascii="Symbol" w:hAnsi="Symbol" w:hint="default"/>
       </w:rPr>
     </w:lvl>
-    <w:lvl w:ilvl="1" w:tplc="0C0A0003" w:tentative="1">
+    <w:lvl w:ilvl="1" w:tplc="0C0A0003">
       <w:start w:val="1"/>
       <w:numFmt w:val="bullet"/>
       <w:lvlText w:val="o"/>
@@ -594,10 +678,13 @@
     </w:lvl>
   </w:abstractNum>
   <w:num w:numId="1" w16cid:durableId="184902360">
-    <w:abstractNumId w:val="0"/>
+    <w:abstractNumId w:val="1"/>
   </w:num>
   <w:num w:numId="2" w16cid:durableId="435180094">
-    <w:abstractNumId w:val="1"/>
+    <w:abstractNumId w:val="2"/>
+  </w:num>
+  <w:num w:numId="3" w16cid:durableId="946154222">
+    <w:abstractNumId w:val="0"/>
   </w:num>
 </w:numbering>
 </file>
@@ -1205,7 +1292,6 @@
   <w:style w:type="character" w:default="1" w:styleId="Fuentedeprrafopredeter">
     <w:name w:val="Default Paragraph Font"/>
     <w:uiPriority w:val="1"/>
-    <w:semiHidden/>
     <w:unhideWhenUsed/>
   </w:style>
   <w:style w:type="table" w:default="1" w:styleId="Tablanormal">

</xml_diff>